<commit_message>
Add output.txt execution results for Assignments 1, 2, and 3
</commit_message>
<xml_diff>
--- a/Assignment_1_Merge_Sort/Assignment_1_Merge_Sort.docx
+++ b/Assignment_1_Merge_Sort/Assignment_1_Merge_Sort.docx
@@ -8,7 +8,7 @@
         <w:shd w:val="clear" w:color="auto" w:fill="F4F7FA"/>
         <w:spacing w:before="0" w:after="0" w:afterAutospacing="0"/>
         <w:jc w:val="center"/>
-        <w:divId w:val="971517972"/>
+        <w:divId w:val="796683721"/>
         <w:rPr>
           <w:rFonts w:ascii="Calibri" w:eastAsia="Times New Roman" w:hAnsi="Calibri" w:cs="Calibri"/>
           <w:color w:val="003366"/>
@@ -27,7 +27,7 @@
         <w:pStyle w:val="Heading1"/>
         <w:shd w:val="clear" w:color="auto" w:fill="F4F7FA"/>
         <w:spacing w:before="75" w:beforeAutospacing="0"/>
-        <w:divId w:val="971517972"/>
+        <w:divId w:val="796683721"/>
         <w:rPr>
           <w:rFonts w:ascii="Calibri" w:eastAsia="Times New Roman" w:hAnsi="Calibri" w:cs="Calibri"/>
         </w:rPr>
@@ -45,7 +45,7 @@
         <w:shd w:val="clear" w:color="auto" w:fill="F4F7FA"/>
         <w:spacing w:before="0" w:beforeAutospacing="0" w:after="0" w:afterAutospacing="0"/>
         <w:jc w:val="center"/>
-        <w:divId w:val="971517972"/>
+        <w:divId w:val="796683721"/>
         <w:rPr>
           <w:rFonts w:ascii="Calibri" w:hAnsi="Calibri" w:cs="Calibri"/>
           <w:i/>
@@ -69,7 +69,7 @@
         <w:shd w:val="clear" w:color="auto" w:fill="F4F7FA"/>
         <w:spacing w:before="45" w:beforeAutospacing="0" w:after="45" w:afterAutospacing="0"/>
         <w:jc w:val="center"/>
-        <w:divId w:val="971517972"/>
+        <w:divId w:val="796683721"/>
         <w:rPr>
           <w:rFonts w:ascii="Calibri" w:hAnsi="Calibri" w:cs="Calibri"/>
           <w:color w:val="1A1A1A"/>
@@ -91,18 +91,18 @@
       <w:pPr>
         <w:shd w:val="clear" w:color="auto" w:fill="F4F7FA"/>
         <w:jc w:val="center"/>
-        <w:divId w:val="971517972"/>
-        <w:rPr>
-          <w:rFonts w:ascii="Calibri" w:eastAsia="Times New Roman" w:hAnsi="Calibri" w:cs="Calibri"/>
-          <w:color w:val="1A1A1A"/>
-        </w:rPr>
-      </w:pPr>
-      <w:r>
-        <w:rPr>
-          <w:rFonts w:ascii="Calibri" w:eastAsia="Times New Roman" w:hAnsi="Calibri" w:cs="Calibri"/>
-          <w:color w:val="1A1A1A"/>
-        </w:rPr>
-        <w:pict w14:anchorId="63A83728">
+        <w:divId w:val="796683721"/>
+        <w:rPr>
+          <w:rFonts w:ascii="Calibri" w:eastAsia="Times New Roman" w:hAnsi="Calibri" w:cs="Calibri"/>
+          <w:color w:val="1A1A1A"/>
+        </w:rPr>
+      </w:pPr>
+      <w:r>
+        <w:rPr>
+          <w:rFonts w:ascii="Calibri" w:eastAsia="Times New Roman" w:hAnsi="Calibri" w:cs="Calibri"/>
+          <w:color w:val="1A1A1A"/>
+        </w:rPr>
+        <w:pict w14:anchorId="52C46FCC">
           <v:rect id="_x0000_i1025" style="width:0;height:1.5pt" o:hralign="center" o:hrstd="t" o:hr="t" fillcolor="#a0a0a0" stroked="f"/>
         </w:pict>
       </w:r>
@@ -116,7 +116,7 @@
         <w:shd w:val="clear" w:color="auto" w:fill="F4F7FA"/>
         <w:spacing w:before="75" w:after="75" w:afterAutospacing="0"/>
         <w:jc w:val="center"/>
-        <w:divId w:val="971517972"/>
+        <w:divId w:val="796683721"/>
         <w:rPr>
           <w:rFonts w:ascii="Calibri" w:eastAsia="Times New Roman" w:hAnsi="Calibri" w:cs="Calibri"/>
           <w:color w:val="003366"/>
@@ -135,7 +135,7 @@
         <w:pStyle w:val="NormalWeb"/>
         <w:shd w:val="clear" w:color="auto" w:fill="EEF4FB"/>
         <w:spacing w:before="45" w:beforeAutospacing="0" w:after="45" w:afterAutospacing="0"/>
-        <w:divId w:val="69157769"/>
+        <w:divId w:val="1614820004"/>
         <w:rPr>
           <w:rFonts w:ascii="Calibri" w:hAnsi="Calibri" w:cs="Calibri"/>
           <w:b/>
@@ -166,7 +166,7 @@
         <w:pStyle w:val="NormalWeb"/>
         <w:shd w:val="clear" w:color="auto" w:fill="EEF4FB"/>
         <w:spacing w:before="45" w:beforeAutospacing="0" w:after="45" w:afterAutospacing="0"/>
-        <w:divId w:val="69157769"/>
+        <w:divId w:val="1614820004"/>
         <w:rPr>
           <w:rFonts w:ascii="Calibri" w:hAnsi="Calibri" w:cs="Calibri"/>
           <w:b/>
@@ -197,7 +197,7 @@
         <w:pStyle w:val="NormalWeb"/>
         <w:shd w:val="clear" w:color="auto" w:fill="EEF4FB"/>
         <w:spacing w:before="45" w:beforeAutospacing="0" w:after="45" w:afterAutospacing="0"/>
-        <w:divId w:val="69157769"/>
+        <w:divId w:val="1614820004"/>
         <w:rPr>
           <w:rFonts w:ascii="Calibri" w:hAnsi="Calibri" w:cs="Calibri"/>
           <w:b/>
@@ -228,7 +228,7 @@
         <w:pStyle w:val="NormalWeb"/>
         <w:shd w:val="clear" w:color="auto" w:fill="EEF4FB"/>
         <w:spacing w:before="45" w:beforeAutospacing="0" w:after="45" w:afterAutospacing="0"/>
-        <w:divId w:val="69157769"/>
+        <w:divId w:val="1614820004"/>
         <w:rPr>
           <w:rFonts w:ascii="Calibri" w:hAnsi="Calibri" w:cs="Calibri"/>
           <w:b/>
@@ -257,7 +257,7 @@
     <w:p>
       <w:pPr>
         <w:pStyle w:val="Heading2"/>
-        <w:divId w:val="1567833806"/>
+        <w:divId w:val="16544875"/>
         <w:rPr>
           <w:rFonts w:ascii="Calibri" w:eastAsia="Times New Roman" w:hAnsi="Calibri" w:cs="Calibri"/>
         </w:rPr>
@@ -272,7 +272,7 @@
     <w:p>
       <w:pPr>
         <w:pStyle w:val="NormalWeb"/>
-        <w:divId w:val="1567833806"/>
+        <w:divId w:val="16544875"/>
         <w:rPr>
           <w:rFonts w:ascii="Calibri" w:hAnsi="Calibri" w:cs="Calibri"/>
           <w:color w:val="1A1A1A"/>
@@ -289,7 +289,7 @@
     <w:p>
       <w:pPr>
         <w:pStyle w:val="Heading2"/>
-        <w:divId w:val="1567833806"/>
+        <w:divId w:val="16544875"/>
         <w:rPr>
           <w:rFonts w:ascii="Calibri" w:eastAsia="Times New Roman" w:hAnsi="Calibri" w:cs="Calibri"/>
         </w:rPr>
@@ -308,7 +308,7 @@
           <w:numId w:val="1"/>
         </w:numPr>
         <w:spacing w:before="100" w:beforeAutospacing="1" w:after="100" w:afterAutospacing="1"/>
-        <w:divId w:val="1567833806"/>
+        <w:divId w:val="16544875"/>
         <w:rPr>
           <w:rFonts w:ascii="Calibri" w:eastAsia="Times New Roman" w:hAnsi="Calibri" w:cs="Calibri"/>
           <w:color w:val="1A1A1A"/>
@@ -329,7 +329,7 @@
           <w:numId w:val="1"/>
         </w:numPr>
         <w:spacing w:before="100" w:beforeAutospacing="1" w:after="100" w:afterAutospacing="1"/>
-        <w:divId w:val="1567833806"/>
+        <w:divId w:val="16544875"/>
         <w:rPr>
           <w:rFonts w:ascii="Calibri" w:eastAsia="Times New Roman" w:hAnsi="Calibri" w:cs="Calibri"/>
           <w:color w:val="1A1A1A"/>
@@ -346,7 +346,7 @@
     <w:p>
       <w:pPr>
         <w:pStyle w:val="Heading2"/>
-        <w:divId w:val="1567833806"/>
+        <w:divId w:val="16544875"/>
         <w:rPr>
           <w:rFonts w:ascii="Calibri" w:eastAsia="Times New Roman" w:hAnsi="Calibri" w:cs="Calibri"/>
         </w:rPr>
@@ -365,7 +365,7 @@
           <w:numId w:val="2"/>
         </w:numPr>
         <w:spacing w:before="100" w:beforeAutospacing="1" w:after="100" w:afterAutospacing="1"/>
-        <w:divId w:val="1567833806"/>
+        <w:divId w:val="16544875"/>
         <w:rPr>
           <w:rFonts w:ascii="Calibri" w:eastAsia="Times New Roman" w:hAnsi="Calibri" w:cs="Calibri"/>
           <w:color w:val="1A1A1A"/>
@@ -386,7 +386,7 @@
           <w:numId w:val="2"/>
         </w:numPr>
         <w:spacing w:before="100" w:beforeAutospacing="1" w:after="100" w:afterAutospacing="1"/>
-        <w:divId w:val="1567833806"/>
+        <w:divId w:val="16544875"/>
         <w:rPr>
           <w:rFonts w:ascii="Calibri" w:eastAsia="Times New Roman" w:hAnsi="Calibri" w:cs="Calibri"/>
           <w:color w:val="1A1A1A"/>
@@ -403,7 +403,7 @@
     <w:p>
       <w:pPr>
         <w:pStyle w:val="Heading2"/>
-        <w:divId w:val="1567833806"/>
+        <w:divId w:val="16544875"/>
         <w:rPr>
           <w:rFonts w:ascii="Calibri" w:eastAsia="Times New Roman" w:hAnsi="Calibri" w:cs="Calibri"/>
         </w:rPr>
@@ -418,7 +418,7 @@
     <w:p>
       <w:pPr>
         <w:pStyle w:val="NormalWeb"/>
-        <w:divId w:val="1567833806"/>
+        <w:divId w:val="16544875"/>
         <w:rPr>
           <w:rFonts w:ascii="Calibri" w:hAnsi="Calibri" w:cs="Calibri"/>
           <w:color w:val="1A1A1A"/>
@@ -435,7 +435,7 @@
     <w:p>
       <w:pPr>
         <w:pStyle w:val="Heading3"/>
-        <w:divId w:val="1567833806"/>
+        <w:divId w:val="16544875"/>
         <w:rPr>
           <w:rFonts w:ascii="Calibri" w:eastAsia="Times New Roman" w:hAnsi="Calibri" w:cs="Calibri"/>
         </w:rPr>
@@ -454,7 +454,7 @@
           <w:numId w:val="3"/>
         </w:numPr>
         <w:spacing w:before="100" w:beforeAutospacing="1" w:after="100" w:afterAutospacing="1"/>
-        <w:divId w:val="1567833806"/>
+        <w:divId w:val="16544875"/>
         <w:rPr>
           <w:rFonts w:ascii="Calibri" w:eastAsia="Times New Roman" w:hAnsi="Calibri" w:cs="Calibri"/>
           <w:color w:val="1A1A1A"/>
@@ -491,7 +491,7 @@
           <w:numId w:val="3"/>
         </w:numPr>
         <w:spacing w:before="100" w:beforeAutospacing="1" w:after="100" w:afterAutospacing="1"/>
-        <w:divId w:val="1567833806"/>
+        <w:divId w:val="16544875"/>
         <w:rPr>
           <w:rFonts w:ascii="Calibri" w:eastAsia="Times New Roman" w:hAnsi="Calibri" w:cs="Calibri"/>
           <w:color w:val="1A1A1A"/>
@@ -520,7 +520,7 @@
           <w:numId w:val="3"/>
         </w:numPr>
         <w:spacing w:before="100" w:beforeAutospacing="1" w:after="100" w:afterAutospacing="1"/>
-        <w:divId w:val="1567833806"/>
+        <w:divId w:val="16544875"/>
         <w:rPr>
           <w:rFonts w:ascii="Calibri" w:eastAsia="Times New Roman" w:hAnsi="Calibri" w:cs="Calibri"/>
           <w:color w:val="1A1A1A"/>
@@ -545,7 +545,7 @@
     <w:p>
       <w:pPr>
         <w:pStyle w:val="Heading3"/>
-        <w:divId w:val="1567833806"/>
+        <w:divId w:val="16544875"/>
         <w:rPr>
           <w:rFonts w:ascii="Calibri" w:eastAsia="Times New Roman" w:hAnsi="Calibri" w:cs="Calibri"/>
         </w:rPr>
@@ -564,7 +564,7 @@
           <w:numId w:val="4"/>
         </w:numPr>
         <w:spacing w:before="100" w:beforeAutospacing="1" w:after="100" w:afterAutospacing="1"/>
-        <w:divId w:val="1567833806"/>
+        <w:divId w:val="16544875"/>
         <w:rPr>
           <w:rFonts w:ascii="Calibri" w:eastAsia="Times New Roman" w:hAnsi="Calibri" w:cs="Calibri"/>
           <w:color w:val="1A1A1A"/>
@@ -631,7 +631,7 @@
           <w:numId w:val="4"/>
         </w:numPr>
         <w:spacing w:before="100" w:beforeAutospacing="1" w:after="100" w:afterAutospacing="1"/>
-        <w:divId w:val="1567833806"/>
+        <w:divId w:val="16544875"/>
         <w:rPr>
           <w:rFonts w:ascii="Calibri" w:eastAsia="Times New Roman" w:hAnsi="Calibri" w:cs="Calibri"/>
           <w:color w:val="1A1A1A"/>
@@ -676,7 +676,7 @@
           <w:numId w:val="4"/>
         </w:numPr>
         <w:spacing w:before="100" w:beforeAutospacing="1" w:after="100" w:afterAutospacing="1"/>
-        <w:divId w:val="1567833806"/>
+        <w:divId w:val="16544875"/>
         <w:rPr>
           <w:rFonts w:ascii="Calibri" w:eastAsia="Times New Roman" w:hAnsi="Calibri" w:cs="Calibri"/>
           <w:color w:val="1A1A1A"/>
@@ -716,7 +716,7 @@
     <w:p>
       <w:pPr>
         <w:pStyle w:val="Heading3"/>
-        <w:divId w:val="1567833806"/>
+        <w:divId w:val="16544875"/>
         <w:rPr>
           <w:rFonts w:ascii="Calibri" w:eastAsia="Times New Roman" w:hAnsi="Calibri" w:cs="Calibri"/>
         </w:rPr>
@@ -735,7 +735,7 @@
           <w:numId w:val="5"/>
         </w:numPr>
         <w:spacing w:before="100" w:beforeAutospacing="1" w:after="100" w:afterAutospacing="1"/>
-        <w:divId w:val="1567833806"/>
+        <w:divId w:val="16544875"/>
         <w:rPr>
           <w:rFonts w:ascii="Calibri" w:eastAsia="Times New Roman" w:hAnsi="Calibri" w:cs="Calibri"/>
           <w:color w:val="1A1A1A"/>
@@ -764,7 +764,7 @@
           <w:numId w:val="5"/>
         </w:numPr>
         <w:spacing w:before="100" w:beforeAutospacing="1" w:after="100" w:afterAutospacing="1"/>
-        <w:divId w:val="1567833806"/>
+        <w:divId w:val="16544875"/>
         <w:rPr>
           <w:rFonts w:ascii="Calibri" w:eastAsia="Times New Roman" w:hAnsi="Calibri" w:cs="Calibri"/>
           <w:color w:val="1A1A1A"/>
@@ -793,7 +793,7 @@
           <w:numId w:val="5"/>
         </w:numPr>
         <w:spacing w:before="100" w:beforeAutospacing="1" w:after="100" w:afterAutospacing="1"/>
-        <w:divId w:val="1567833806"/>
+        <w:divId w:val="16544875"/>
         <w:rPr>
           <w:rFonts w:ascii="Calibri" w:eastAsia="Times New Roman" w:hAnsi="Calibri" w:cs="Calibri"/>
           <w:color w:val="1A1A1A"/>
@@ -818,7 +818,7 @@
     <w:p>
       <w:pPr>
         <w:pStyle w:val="Heading3"/>
-        <w:divId w:val="1567833806"/>
+        <w:divId w:val="16544875"/>
         <w:rPr>
           <w:rFonts w:ascii="Calibri" w:eastAsia="Times New Roman" w:hAnsi="Calibri" w:cs="Calibri"/>
         </w:rPr>
@@ -833,7 +833,7 @@
     <w:p>
       <w:pPr>
         <w:pStyle w:val="NormalWeb"/>
-        <w:divId w:val="1567833806"/>
+        <w:divId w:val="16544875"/>
         <w:rPr>
           <w:rFonts w:ascii="Calibri" w:hAnsi="Calibri" w:cs="Calibri"/>
           <w:color w:val="1A1A1A"/>
@@ -866,7 +866,7 @@
     <w:p>
       <w:pPr>
         <w:pStyle w:val="Heading2"/>
-        <w:divId w:val="1567833806"/>
+        <w:divId w:val="16544875"/>
         <w:rPr>
           <w:rFonts w:ascii="Calibri" w:eastAsia="Times New Roman" w:hAnsi="Calibri" w:cs="Calibri"/>
         </w:rPr>
@@ -881,16 +881,16 @@
     <w:p>
       <w:pPr>
         <w:pStyle w:val="HTMLPreformatted"/>
-        <w:divId w:val="1567833806"/>
-        <w:rPr>
-          <w:color w:val="1A1A1A"/>
-        </w:rPr>
-      </w:pPr>
-    </w:p>
-    <w:p>
-      <w:pPr>
-        <w:pStyle w:val="HTMLPreformatted"/>
-        <w:divId w:val="1567833806"/>
+        <w:divId w:val="16544875"/>
+        <w:rPr>
+          <w:color w:val="1A1A1A"/>
+        </w:rPr>
+      </w:pPr>
+    </w:p>
+    <w:p>
+      <w:pPr>
+        <w:pStyle w:val="HTMLPreformatted"/>
+        <w:divId w:val="16544875"/>
         <w:rPr>
           <w:color w:val="1A1A1A"/>
         </w:rPr>
@@ -905,7 +905,7 @@
     <w:p>
       <w:pPr>
         <w:pStyle w:val="HTMLPreformatted"/>
-        <w:divId w:val="1567833806"/>
+        <w:divId w:val="16544875"/>
         <w:rPr>
           <w:color w:val="1A1A1A"/>
         </w:rPr>
@@ -920,7 +920,7 @@
     <w:p>
       <w:pPr>
         <w:pStyle w:val="HTMLPreformatted"/>
-        <w:divId w:val="1567833806"/>
+        <w:divId w:val="16544875"/>
         <w:rPr>
           <w:color w:val="1A1A1A"/>
         </w:rPr>
@@ -935,7 +935,7 @@
     <w:p>
       <w:pPr>
         <w:pStyle w:val="HTMLPreformatted"/>
-        <w:divId w:val="1567833806"/>
+        <w:divId w:val="16544875"/>
         <w:rPr>
           <w:color w:val="1A1A1A"/>
         </w:rPr>
@@ -950,7 +950,7 @@
     <w:p>
       <w:pPr>
         <w:pStyle w:val="HTMLPreformatted"/>
-        <w:divId w:val="1567833806"/>
+        <w:divId w:val="16544875"/>
         <w:rPr>
           <w:color w:val="1A1A1A"/>
         </w:rPr>
@@ -965,7 +965,7 @@
     <w:p>
       <w:pPr>
         <w:pStyle w:val="HTMLPreformatted"/>
-        <w:divId w:val="1567833806"/>
+        <w:divId w:val="16544875"/>
         <w:rPr>
           <w:color w:val="1A1A1A"/>
         </w:rPr>
@@ -980,7 +980,7 @@
     <w:p>
       <w:pPr>
         <w:pStyle w:val="HTMLPreformatted"/>
-        <w:divId w:val="1567833806"/>
+        <w:divId w:val="16544875"/>
         <w:rPr>
           <w:color w:val="1A1A1A"/>
         </w:rPr>
@@ -995,7 +995,7 @@
     <w:p>
       <w:pPr>
         <w:pStyle w:val="HTMLPreformatted"/>
-        <w:divId w:val="1567833806"/>
+        <w:divId w:val="16544875"/>
         <w:rPr>
           <w:color w:val="1A1A1A"/>
         </w:rPr>
@@ -1010,7 +1010,7 @@
     <w:p>
       <w:pPr>
         <w:pStyle w:val="HTMLPreformatted"/>
-        <w:divId w:val="1567833806"/>
+        <w:divId w:val="16544875"/>
         <w:rPr>
           <w:color w:val="1A1A1A"/>
         </w:rPr>
@@ -1025,16 +1025,16 @@
     <w:p>
       <w:pPr>
         <w:pStyle w:val="HTMLPreformatted"/>
-        <w:divId w:val="1567833806"/>
-        <w:rPr>
-          <w:color w:val="1A1A1A"/>
-        </w:rPr>
-      </w:pPr>
-    </w:p>
-    <w:p>
-      <w:pPr>
-        <w:pStyle w:val="HTMLPreformatted"/>
-        <w:divId w:val="1567833806"/>
+        <w:divId w:val="16544875"/>
+        <w:rPr>
+          <w:color w:val="1A1A1A"/>
+        </w:rPr>
+      </w:pPr>
+    </w:p>
+    <w:p>
+      <w:pPr>
+        <w:pStyle w:val="HTMLPreformatted"/>
+        <w:divId w:val="16544875"/>
         <w:rPr>
           <w:color w:val="1A1A1A"/>
         </w:rPr>
@@ -1049,7 +1049,7 @@
     <w:p>
       <w:pPr>
         <w:pStyle w:val="HTMLPreformatted"/>
-        <w:divId w:val="1567833806"/>
+        <w:divId w:val="16544875"/>
         <w:rPr>
           <w:color w:val="1A1A1A"/>
         </w:rPr>
@@ -1064,7 +1064,7 @@
     <w:p>
       <w:pPr>
         <w:pStyle w:val="HTMLPreformatted"/>
-        <w:divId w:val="1567833806"/>
+        <w:divId w:val="16544875"/>
         <w:rPr>
           <w:color w:val="1A1A1A"/>
         </w:rPr>
@@ -1079,7 +1079,7 @@
     <w:p>
       <w:pPr>
         <w:pStyle w:val="HTMLPreformatted"/>
-        <w:divId w:val="1567833806"/>
+        <w:divId w:val="16544875"/>
         <w:rPr>
           <w:color w:val="1A1A1A"/>
         </w:rPr>
@@ -1094,7 +1094,7 @@
     <w:p>
       <w:pPr>
         <w:pStyle w:val="HTMLPreformatted"/>
-        <w:divId w:val="1567833806"/>
+        <w:divId w:val="16544875"/>
         <w:rPr>
           <w:color w:val="1A1A1A"/>
         </w:rPr>
@@ -1109,7 +1109,7 @@
     <w:p>
       <w:pPr>
         <w:pStyle w:val="HTMLPreformatted"/>
-        <w:divId w:val="1567833806"/>
+        <w:divId w:val="16544875"/>
         <w:rPr>
           <w:color w:val="1A1A1A"/>
         </w:rPr>
@@ -1130,7 +1130,7 @@
     <w:p>
       <w:pPr>
         <w:pStyle w:val="HTMLPreformatted"/>
-        <w:divId w:val="1567833806"/>
+        <w:divId w:val="16544875"/>
         <w:rPr>
           <w:color w:val="1A1A1A"/>
         </w:rPr>
@@ -1145,7 +1145,7 @@
     <w:p>
       <w:pPr>
         <w:pStyle w:val="HTMLPreformatted"/>
-        <w:divId w:val="1567833806"/>
+        <w:divId w:val="16544875"/>
         <w:rPr>
           <w:color w:val="1A1A1A"/>
         </w:rPr>
@@ -1160,7 +1160,7 @@
     <w:p>
       <w:pPr>
         <w:pStyle w:val="HTMLPreformatted"/>
-        <w:divId w:val="1567833806"/>
+        <w:divId w:val="16544875"/>
         <w:rPr>
           <w:color w:val="1A1A1A"/>
         </w:rPr>
@@ -1175,7 +1175,7 @@
     <w:p>
       <w:pPr>
         <w:pStyle w:val="HTMLPreformatted"/>
-        <w:divId w:val="1567833806"/>
+        <w:divId w:val="16544875"/>
         <w:rPr>
           <w:color w:val="1A1A1A"/>
         </w:rPr>
@@ -1190,7 +1190,7 @@
     <w:p>
       <w:pPr>
         <w:pStyle w:val="HTMLPreformatted"/>
-        <w:divId w:val="1567833806"/>
+        <w:divId w:val="16544875"/>
         <w:rPr>
           <w:color w:val="1A1A1A"/>
         </w:rPr>
@@ -1205,7 +1205,7 @@
     <w:p>
       <w:pPr>
         <w:pStyle w:val="HTMLPreformatted"/>
-        <w:divId w:val="1567833806"/>
+        <w:divId w:val="16544875"/>
         <w:rPr>
           <w:color w:val="1A1A1A"/>
         </w:rPr>
@@ -1221,7 +1221,7 @@
     <w:p>
       <w:pPr>
         <w:pStyle w:val="HTMLPreformatted"/>
-        <w:divId w:val="1567833806"/>
+        <w:divId w:val="16544875"/>
         <w:rPr>
           <w:color w:val="1A1A1A"/>
         </w:rPr>
@@ -1236,7 +1236,7 @@
     <w:p>
       <w:pPr>
         <w:pStyle w:val="HTMLPreformatted"/>
-        <w:divId w:val="1567833806"/>
+        <w:divId w:val="16544875"/>
         <w:rPr>
           <w:color w:val="1A1A1A"/>
         </w:rPr>
@@ -1251,7 +1251,7 @@
     <w:p>
       <w:pPr>
         <w:pStyle w:val="HTMLPreformatted"/>
-        <w:divId w:val="1567833806"/>
+        <w:divId w:val="16544875"/>
         <w:rPr>
           <w:color w:val="1A1A1A"/>
         </w:rPr>
@@ -1266,7 +1266,7 @@
     <w:p>
       <w:pPr>
         <w:pStyle w:val="HTMLPreformatted"/>
-        <w:divId w:val="1567833806"/>
+        <w:divId w:val="16544875"/>
         <w:rPr>
           <w:color w:val="1A1A1A"/>
         </w:rPr>
@@ -1281,7 +1281,7 @@
     <w:p>
       <w:pPr>
         <w:pStyle w:val="HTMLPreformatted"/>
-        <w:divId w:val="1567833806"/>
+        <w:divId w:val="16544875"/>
         <w:rPr>
           <w:color w:val="1A1A1A"/>
         </w:rPr>
@@ -1296,7 +1296,7 @@
     <w:p>
       <w:pPr>
         <w:pStyle w:val="HTMLPreformatted"/>
-        <w:divId w:val="1567833806"/>
+        <w:divId w:val="16544875"/>
         <w:rPr>
           <w:color w:val="1A1A1A"/>
         </w:rPr>
@@ -1311,7 +1311,7 @@
     <w:p>
       <w:pPr>
         <w:pStyle w:val="HTMLPreformatted"/>
-        <w:divId w:val="1567833806"/>
+        <w:divId w:val="16544875"/>
         <w:rPr>
           <w:color w:val="1A1A1A"/>
         </w:rPr>
@@ -1326,7 +1326,7 @@
     <w:p>
       <w:pPr>
         <w:pStyle w:val="HTMLPreformatted"/>
-        <w:divId w:val="1567833806"/>
+        <w:divId w:val="16544875"/>
         <w:rPr>
           <w:color w:val="1A1A1A"/>
         </w:rPr>
@@ -1341,7 +1341,7 @@
     <w:p>
       <w:pPr>
         <w:pStyle w:val="HTMLPreformatted"/>
-        <w:divId w:val="1567833806"/>
+        <w:divId w:val="16544875"/>
         <w:rPr>
           <w:color w:val="1A1A1A"/>
         </w:rPr>
@@ -1356,7 +1356,7 @@
     <w:p>
       <w:pPr>
         <w:pStyle w:val="HTMLPreformatted"/>
-        <w:divId w:val="1567833806"/>
+        <w:divId w:val="16544875"/>
         <w:rPr>
           <w:color w:val="1A1A1A"/>
         </w:rPr>
@@ -1371,7 +1371,7 @@
     <w:p>
       <w:pPr>
         <w:pStyle w:val="HTMLPreformatted"/>
-        <w:divId w:val="1567833806"/>
+        <w:divId w:val="16544875"/>
         <w:rPr>
           <w:color w:val="1A1A1A"/>
         </w:rPr>
@@ -1386,7 +1386,7 @@
     <w:p>
       <w:pPr>
         <w:pStyle w:val="Heading2"/>
-        <w:divId w:val="1567833806"/>
+        <w:divId w:val="16544875"/>
         <w:rPr>
           <w:rFonts w:ascii="Calibri" w:eastAsia="Times New Roman" w:hAnsi="Calibri" w:cs="Calibri"/>
         </w:rPr>
@@ -1401,7 +1401,7 @@
     <w:p>
       <w:pPr>
         <w:pStyle w:val="NormalWeb"/>
-        <w:divId w:val="1567833806"/>
+        <w:divId w:val="16544875"/>
         <w:rPr>
           <w:rFonts w:ascii="Calibri" w:hAnsi="Calibri" w:cs="Calibri"/>
           <w:color w:val="1A1A1A"/>
@@ -1418,7 +1418,7 @@
     <w:p>
       <w:pPr>
         <w:pStyle w:val="NormalWeb"/>
-        <w:divId w:val="1567833806"/>
+        <w:divId w:val="16544875"/>
         <w:rPr>
           <w:rFonts w:ascii="Calibri" w:hAnsi="Calibri" w:cs="Calibri"/>
           <w:color w:val="1A1A1A"/>
@@ -1436,7 +1436,7 @@
       <w:pPr>
         <w:pStyle w:val="NormalWeb"/>
         <w:shd w:val="clear" w:color="auto" w:fill="E6F2FF"/>
-        <w:divId w:val="1235510875"/>
+        <w:divId w:val="1197347521"/>
         <w:rPr>
           <w:rFonts w:ascii="Calibri" w:hAnsi="Calibri" w:cs="Calibri"/>
           <w:color w:val="1A1A1A"/>
@@ -1462,7 +1462,7 @@
       <w:pPr>
         <w:pStyle w:val="NormalWeb"/>
         <w:shd w:val="clear" w:color="auto" w:fill="E6F2FF"/>
-        <w:divId w:val="1235510875"/>
+        <w:divId w:val="1197347521"/>
         <w:rPr>
           <w:rFonts w:ascii="Calibri" w:hAnsi="Calibri" w:cs="Calibri"/>
           <w:color w:val="1A1A1A"/>
@@ -1487,7 +1487,7 @@
     <w:p>
       <w:pPr>
         <w:pStyle w:val="Heading2"/>
-        <w:divId w:val="1567833806"/>
+        <w:divId w:val="16544875"/>
         <w:rPr>
           <w:rFonts w:ascii="Calibri" w:eastAsia="Times New Roman" w:hAnsi="Calibri" w:cs="Calibri"/>
         </w:rPr>
@@ -1502,16 +1502,16 @@
     <w:p>
       <w:pPr>
         <w:pStyle w:val="HTMLPreformatted"/>
-        <w:divId w:val="1567833806"/>
-        <w:rPr>
-          <w:color w:val="1A1A1A"/>
-        </w:rPr>
-      </w:pPr>
-    </w:p>
-    <w:p>
-      <w:pPr>
-        <w:pStyle w:val="HTMLPreformatted"/>
-        <w:divId w:val="1567833806"/>
+        <w:divId w:val="16544875"/>
+        <w:rPr>
+          <w:color w:val="1A1A1A"/>
+        </w:rPr>
+      </w:pPr>
+    </w:p>
+    <w:p>
+      <w:pPr>
+        <w:pStyle w:val="HTMLPreformatted"/>
+        <w:divId w:val="16544875"/>
         <w:rPr>
           <w:color w:val="1A1A1A"/>
         </w:rPr>
@@ -1526,7 +1526,7 @@
     <w:p>
       <w:pPr>
         <w:pStyle w:val="HTMLPreformatted"/>
-        <w:divId w:val="1567833806"/>
+        <w:divId w:val="16544875"/>
         <w:rPr>
           <w:color w:val="1A1A1A"/>
         </w:rPr>
@@ -1541,7 +1541,7 @@
     <w:p>
       <w:pPr>
         <w:pStyle w:val="Heading2"/>
-        <w:divId w:val="1567833806"/>
+        <w:divId w:val="16544875"/>
         <w:rPr>
           <w:rFonts w:ascii="Calibri" w:eastAsia="Times New Roman" w:hAnsi="Calibri" w:cs="Calibri"/>
         </w:rPr>
@@ -1556,7 +1556,7 @@
     <w:p>
       <w:pPr>
         <w:pStyle w:val="NormalWeb"/>
-        <w:divId w:val="1567833806"/>
+        <w:divId w:val="16544875"/>
         <w:rPr>
           <w:rFonts w:ascii="Calibri" w:hAnsi="Calibri" w:cs="Calibri"/>
           <w:color w:val="1A1A1A"/>
@@ -1575,7 +1575,7 @@
     <w:p>
       <w:pPr>
         <w:pStyle w:val="Heading2"/>
-        <w:divId w:val="1567833806"/>
+        <w:divId w:val="16544875"/>
         <w:rPr>
           <w:rFonts w:ascii="Calibri" w:eastAsia="Times New Roman" w:hAnsi="Calibri" w:cs="Calibri"/>
         </w:rPr>
@@ -1590,7 +1590,7 @@
     <w:p>
       <w:pPr>
         <w:pStyle w:val="NormalWeb"/>
-        <w:divId w:val="1567833806"/>
+        <w:divId w:val="16544875"/>
         <w:rPr>
           <w:rFonts w:ascii="Calibri" w:hAnsi="Calibri" w:cs="Calibri"/>
           <w:color w:val="1A1A1A"/>
@@ -1617,9 +1617,9 @@
 <file path=word/numbering.xml><?xml version="1.0" encoding="utf-8"?>
 <w:numbering xmlns:wpc="http://schemas.microsoft.com/office/word/2010/wordprocessingCanvas" xmlns:cx="http://schemas.microsoft.com/office/drawing/2014/chartex" xmlns:cx1="http://schemas.microsoft.com/office/drawing/2015/9/8/chartex" xmlns:cx2="http://schemas.microsoft.com/office/drawing/2015/10/21/chartex" xmlns:cx3="http://schemas.microsoft.com/office/drawing/2016/5/9/chartex" xmlns:cx4="http://schemas.microsoft.com/office/drawing/2016/5/10/chartex" xmlns:cx5="http://schemas.microsoft.com/office/drawing/2016/5/11/chartex" xmlns:cx6="http://schemas.microsoft.com/office/drawing/2016/5/12/chartex" xmlns:cx7="http://schemas.microsoft.com/office/drawing/2016/5/13/chartex" xmlns:cx8="http://schemas.microsoft.com/office/drawing/2016/5/14/chartex" xmlns:mc="http://schemas.openxmlformats.org/markup-compatibility/2006" xmlns:aink="http://schemas.microsoft.com/office/drawing/2016/ink" xmlns:am3d="http://schemas.microsoft.com/office/drawing/2017/model3d" xmlns:o="urn:schemas-microsoft-com:office:office" xmlns:oel="http://schemas.microsoft.com/office/2019/extlst" xmlns:r="http://schemas.openxmlformats.org/officeDocument/2006/relationships" xmlns:m="http://schemas.openxmlformats.org/officeDocument/2006/math" xmlns:v="urn:schemas-microsoft-com:vml" xmlns:wp14="http://schemas.microsoft.com/office/word/2010/wordprocessingDrawing" xmlns:wp="http://schemas.openxmlformats.org/drawingml/2006/wordprocessingDrawing" xmlns:w10="urn:schemas-microsoft-com:office:word" xmlns:w="http://schemas.openxmlformats.org/wordprocessingml/2006/main" xmlns:w14="http://schemas.microsoft.com/office/word/2010/wordml" xmlns:w15="http://schemas.microsoft.com/office/word/2012/wordml" xmlns:w16cex="http://schemas.microsoft.com/office/word/2018/wordml/cex" xmlns:w16cid="http://schemas.microsoft.com/office/word/2016/wordml/cid" xmlns:w16="http://schemas.microsoft.com/office/word/2018/wordml" xmlns:w16du="http://schemas.microsoft.com/office/word/2023/wordml/word16du" xmlns:w16sdtdh="http://schemas.microsoft.com/office/word/2020/wordml/sdtdatahash" xmlns:w16sdtfl="http://schemas.microsoft.com/office/word/2024/wordml/sdtformatlock" xmlns:w16se="http://schemas.microsoft.com/office/word/2015/wordml/symex" xmlns:wpg="http://schemas.microsoft.com/office/word/2010/wordprocessingGroup" xmlns:wpi="http://schemas.microsoft.com/office/word/2010/wordprocessingInk" xmlns:wne="http://schemas.microsoft.com/office/word/2006/wordml" xmlns:wps="http://schemas.microsoft.com/office/word/2010/wordprocessingShape" mc:Ignorable="w14 w15 w16se w16cid w16 w16cex w16sdtdh w16sdtfl w16du wp14">
   <w:abstractNum w:abstractNumId="0" w15:restartNumberingAfterBreak="0">
-    <w:nsid w:val="00A56FCD"/>
+    <w:nsid w:val="02510578"/>
     <w:multiLevelType w:val="multilevel"/>
-    <w:tmpl w:val="B0C28E08"/>
+    <w:tmpl w:val="1F1E20C8"/>
     <w:lvl w:ilvl="0">
       <w:start w:val="1"/>
       <w:numFmt w:val="bullet"/>
@@ -1766,9 +1766,9 @@
     </w:lvl>
   </w:abstractNum>
   <w:abstractNum w:abstractNumId="1" w15:restartNumberingAfterBreak="0">
-    <w:nsid w:val="02B34ECD"/>
+    <w:nsid w:val="50010A66"/>
     <w:multiLevelType w:val="multilevel"/>
-    <w:tmpl w:val="09DA42D8"/>
+    <w:tmpl w:val="00D897E6"/>
     <w:lvl w:ilvl="0">
       <w:start w:val="1"/>
       <w:numFmt w:val="bullet"/>
@@ -1915,9 +1915,9 @@
     </w:lvl>
   </w:abstractNum>
   <w:abstractNum w:abstractNumId="2" w15:restartNumberingAfterBreak="0">
-    <w:nsid w:val="1CA9363E"/>
+    <w:nsid w:val="555B392E"/>
     <w:multiLevelType w:val="multilevel"/>
-    <w:tmpl w:val="74069EB6"/>
+    <w:tmpl w:val="BF40AE48"/>
     <w:lvl w:ilvl="0">
       <w:start w:val="1"/>
       <w:numFmt w:val="bullet"/>
@@ -2064,9 +2064,9 @@
     </w:lvl>
   </w:abstractNum>
   <w:abstractNum w:abstractNumId="3" w15:restartNumberingAfterBreak="0">
-    <w:nsid w:val="4BF94C99"/>
+    <w:nsid w:val="7107678D"/>
     <w:multiLevelType w:val="multilevel"/>
-    <w:tmpl w:val="7A78E330"/>
+    <w:tmpl w:val="ADA0553A"/>
     <w:lvl w:ilvl="0">
       <w:start w:val="1"/>
       <w:numFmt w:val="bullet"/>
@@ -2213,9 +2213,9 @@
     </w:lvl>
   </w:abstractNum>
   <w:abstractNum w:abstractNumId="4" w15:restartNumberingAfterBreak="0">
-    <w:nsid w:val="540F0D0B"/>
+    <w:nsid w:val="74966663"/>
     <w:multiLevelType w:val="multilevel"/>
-    <w:tmpl w:val="294ED95E"/>
+    <w:tmpl w:val="41A2736A"/>
     <w:lvl w:ilvl="0">
       <w:start w:val="1"/>
       <w:numFmt w:val="bullet"/>
@@ -2361,19 +2361,19 @@
       </w:rPr>
     </w:lvl>
   </w:abstractNum>
-  <w:num w:numId="1" w16cid:durableId="1466460956">
+  <w:num w:numId="1" w16cid:durableId="1708984877">
     <w:abstractNumId w:val="1"/>
   </w:num>
-  <w:num w:numId="2" w16cid:durableId="1032072774">
+  <w:num w:numId="2" w16cid:durableId="272399069">
+    <w:abstractNumId w:val="0"/>
+  </w:num>
+  <w:num w:numId="3" w16cid:durableId="1297103071">
+    <w:abstractNumId w:val="2"/>
+  </w:num>
+  <w:num w:numId="4" w16cid:durableId="90517769">
     <w:abstractNumId w:val="4"/>
   </w:num>
-  <w:num w:numId="3" w16cid:durableId="462970329">
-    <w:abstractNumId w:val="0"/>
-  </w:num>
-  <w:num w:numId="4" w16cid:durableId="324749872">
-    <w:abstractNumId w:val="2"/>
-  </w:num>
-  <w:num w:numId="5" w16cid:durableId="537356126">
+  <w:num w:numId="5" w16cid:durableId="2026713462">
     <w:abstractNumId w:val="3"/>
   </w:num>
 </w:numbering>

</xml_diff>